<commit_message>
docs(commercial): corrige la bible de démarchage — relais employé, livraison Pièces, closing prélancement
- La saisie par l'agent Liaison est présentée comme le démarrage : un employé
  du vendeur prend le relais pour les arrivages suivants (promesse, objection
  « pas le temps de saisir », étapes d'après-signature, fiche de compte-rendu).
- Le vendeur ne reçoit plus « ses clients par WhatsApp » : Pièces lui transmet
  la commande déjà payée et assure la livraison.
- Closing recadré sur le prélancement à trente jours : plus d'essai « à
  observer sur quinze jours », on vend la primauté et le positionnement
  « le Jumia des pièces détachées ».

Co-Authored-By: Claude Opus 5 (1M context) <noreply@anthropic.com>
Claude-Session: https://claude.ai/code/session_01RASqV7Cvww6ZeGGcmp3QmQ
</commit_message>
<xml_diff>
--- a/docs/guide-prospection-vendeurs-2026-08.docx
+++ b/docs/guide-prospection-vendeurs-2026-08.docx
@@ -2,7 +2,7 @@
 <file path=word/document.xml><?xml version="1.0" encoding="utf-8"?>
 <w:document xmlns:w="http://schemas.openxmlformats.org/wordprocessingml/2006/main" xmlns:m="http://schemas.openxmlformats.org/officeDocument/2006/math" xmlns:r="http://schemas.openxmlformats.org/officeDocument/2006/relationships" xmlns:o="urn:schemas-microsoft-com:office:office" xmlns:v="urn:schemas-microsoft-com:vml" xmlns:w10="urn:schemas-microsoft-com:office:word" xmlns:a="http://schemas.openxmlformats.org/drawingml/2006/main" xmlns:pic="http://schemas.openxmlformats.org/drawingml/2006/picture" xmlns:wp="http://schemas.openxmlformats.org/drawingml/2006/wordprocessingDrawing">
   <w:body>
-    <w:bookmarkStart w:id="38" w:name="la-bible-du-démarchage-vendeurs"/>
+    <w:bookmarkStart w:id="39" w:name="la-bible-du-démarchage-vendeurs"/>
     <w:p>
       <w:pPr>
         <w:pStyle w:val="Heading1"/>
@@ -417,7 +417,7 @@
           <w:b/>
           <w:bCs/>
         </w:rPr>
-        <w:t xml:space="preserve">« Un agent vient chez vous, photographie votre stock, le publie en ligne. Vous recevez des clients par WhatsApp, sans changer votre façon de travailler. »</w:t>
+        <w:t xml:space="preserve">« Un agent vient chez vous, photographie votre stock, le publie en ligne. Nous vous apportons les commandes déjà payées, et c'est nous qui livrons. Vous ne changez rien à votre façon de travailler. »</w:t>
       </w:r>
     </w:p>
     <w:p>
@@ -463,13 +463,42 @@
           <w:b/>
           <w:bCs/>
         </w:rPr>
-        <w:t xml:space="preserve">La saisie est faite par nous.</w:t>
-      </w:r>
-      <w:r>
-        <w:t xml:space="preserve"> </w:t>
-      </w:r>
-      <w:r>
-        <w:t xml:space="preserve">Un agent Liaison passe, photographie, décrit, publie. Le vendeur ne tape rien.</w:t>
+        <w:t xml:space="preserve">La saisie de départ est faite par nous.</w:t>
+      </w:r>
+      <w:r>
+        <w:t xml:space="preserve"> </w:t>
+      </w:r>
+      <w:r>
+        <w:t xml:space="preserve">Un agent Liaison passe, photographie, décrit, publie : le vendeur ne tape rien. C'est vrai</w:t>
+      </w:r>
+      <w:r>
+        <w:t xml:space="preserve"> </w:t>
+      </w:r>
+      <w:r>
+        <w:rPr>
+          <w:b/>
+          <w:bCs/>
+        </w:rPr>
+        <w:t xml:space="preserve">au démarrage</w:t>
+      </w:r>
+      <w:r>
+        <w:t xml:space="preserve">, et c'est là qu'il faut être exact — notre agent lance le catalogue, puis</w:t>
+      </w:r>
+      <w:r>
+        <w:t xml:space="preserve"> </w:t>
+      </w:r>
+      <w:r>
+        <w:rPr>
+          <w:b/>
+          <w:bCs/>
+        </w:rPr>
+        <w:t xml:space="preserve">c'est un de ses employés à lui qui prend le relais</w:t>
+      </w:r>
+      <w:r>
+        <w:t xml:space="preserve"> </w:t>
+      </w:r>
+      <w:r>
+        <w:t xml:space="preserve">pour les arrivages suivants. Nous le formons sur place, en une demi-heure, sur son propre téléphone.</w:t>
       </w:r>
     </w:p>
     <w:p>
@@ -529,23 +558,29 @@
           <w:b/>
           <w:bCs/>
         </w:rPr>
-        <w:t xml:space="preserve">Les clients arrivent par WhatsApp.</w:t>
-      </w:r>
-      <w:r>
-        <w:t xml:space="preserve"> </w:t>
-      </w:r>
-      <w:r>
-        <w:t xml:space="preserve">Pas d'application à installer, pas de formation, pas de nouvel outil.</w:t>
-      </w:r>
-    </w:p>
-    <w:bookmarkEnd w:id="21"/>
-    <w:bookmarkStart w:id="22" w:name="X7b1b6d93c8f4a690eb4584eee8ba3ee9b05e0ab"/>
-    <w:p>
-      <w:pPr>
-        <w:pStyle w:val="Heading2"/>
-      </w:pPr>
-      <w:r>
-        <w:t xml:space="preserve">3. Préparer la visite</w:t>
+        <w:t xml:space="preserve">Il n'y a aucun client à gérer.</w:t>
+      </w:r>
+      <w:r>
+        <w:t xml:space="preserve"> </w:t>
+      </w:r>
+      <w:r>
+        <w:t xml:space="preserve">Le client ne l'appelle pas, ne vient pas au comptoir, ne négocie pas.</w:t>
+      </w:r>
+      <w:r>
+        <w:t xml:space="preserve"> </w:t>
+      </w:r>
+      <w:r>
+        <w:rPr>
+          <w:b/>
+          <w:bCs/>
+        </w:rPr>
+        <w:t xml:space="preserve">C'est Pièces qui transmet la commande — déjà payée, avec la référence et le véhicule — et c'est Pièces qui livre.</w:t>
+      </w:r>
+      <w:r>
+        <w:t xml:space="preserve"> </w:t>
+      </w:r>
+      <w:r>
+        <w:t xml:space="preserve">Le vendeur prépare la pièce, nous faisons le reste. Rien à installer : la commande arrive par WhatsApp.</w:t>
       </w:r>
     </w:p>
     <w:p>
@@ -553,7 +588,14 @@
         <w:pStyle w:val="FirstParagraph"/>
       </w:pPr>
       <w:r>
-        <w:t xml:space="preserve">Avant d'entrer, on sait déjà : le nom de l'enseigne, sa zone, son score, ce qu'on croit de sa taille et de sa gamme. C'est la ligne du classeur de prospection.</w:t>
+        <w:rPr>
+          <w:b/>
+          <w:bCs/>
+        </w:rPr>
+        <w:t xml:space="preserve">Deux formulations à bannir</w:t>
+      </w:r>
+      <w:r>
+        <w:t xml:space="preserve">, parce qu'elles créent une déception à la première commande :</w:t>
       </w:r>
     </w:p>
     <w:p>
@@ -565,17 +607,7 @@
         </w:numPr>
       </w:pPr>
       <w:r>
-        <w:rPr>
-          <w:b/>
-          <w:bCs/>
-        </w:rPr>
-        <w:t xml:space="preserve">Matériel</w:t>
-      </w:r>
-      <w:r>
-        <w:t xml:space="preserve"> </w:t>
-      </w:r>
-      <w:r>
-        <w:t xml:space="preserve">: le téléphone chargé, la fiche prospect ouverte, deux ou trois exemples de fiches produits déjà en ligne chez d'autres vendeurs, et rien d'autre. Pas de dossier imprimé à la première visite.</w:t>
+        <w:t xml:space="preserve">« vous recevrez vos clients sur WhatsApp » — non : le client ne le contacte jamais. Nous lui faisons parvenir la commande, et nous assurons la livraison.</w:t>
       </w:r>
     </w:p>
     <w:p>
@@ -587,17 +619,25 @@
         </w:numPr>
       </w:pPr>
       <w:r>
-        <w:rPr>
-          <w:b/>
-          <w:bCs/>
-        </w:rPr>
-        <w:t xml:space="preserve">Qui décide</w:t>
-      </w:r>
-      <w:r>
-        <w:t xml:space="preserve"> </w:t>
-      </w:r>
-      <w:r>
-        <w:t xml:space="preserve">: dans un magasin indépendant, c'est le propriétaire, presque jamais le vendeur au comptoir. Si le patron n'est pas là, on ne fait pas la présentation complète : on prend son nom, son heure de présence, et on revient. Une présentation faite à quelqu'un qui ne décide pas est une présentation à refaire.</w:t>
+        <w:t xml:space="preserve">« un agent passera à chaque arrivage » — non : l'agent lance le catalogue, l'équipe du magasin l'entretient ensuite.</w:t>
+      </w:r>
+    </w:p>
+    <w:bookmarkEnd w:id="21"/>
+    <w:bookmarkStart w:id="22" w:name="X7b1b6d93c8f4a690eb4584eee8ba3ee9b05e0ab"/>
+    <w:p>
+      <w:pPr>
+        <w:pStyle w:val="Heading2"/>
+      </w:pPr>
+      <w:r>
+        <w:t xml:space="preserve">3. Préparer la visite</w:t>
+      </w:r>
+    </w:p>
+    <w:p>
+      <w:pPr>
+        <w:pStyle w:val="FirstParagraph"/>
+      </w:pPr>
+      <w:r>
+        <w:t xml:space="preserve">Avant d'entrer, on sait déjà : le nom de l'enseigne, sa zone, son score, ce qu'on croit de sa taille et de sa gamme. C'est la ligne du classeur de prospection.</w:t>
       </w:r>
     </w:p>
     <w:p>
@@ -605,7 +645,7 @@
         <w:pStyle w:val="Compact"/>
         <w:numPr>
           <w:ilvl w:val="0"/>
-          <w:numId w:val="1003"/>
+          <w:numId w:val="1004"/>
         </w:numPr>
       </w:pPr>
       <w:r>
@@ -613,13 +653,13 @@
           <w:b/>
           <w:bCs/>
         </w:rPr>
-        <w:t xml:space="preserve">Horaires utiles</w:t>
-      </w:r>
-      <w:r>
-        <w:t xml:space="preserve"> </w:t>
-      </w:r>
-      <w:r>
-        <w:t xml:space="preserve">: à Adjamé et Treichville, entre 7 h 30 et 10 h le patron est présent et le magasin n'est pas encore saturé. Après 11 h, on parle à un homme qui sert trois clients en même temps.</w:t>
+        <w:t xml:space="preserve">Matériel</w:t>
+      </w:r>
+      <w:r>
+        <w:t xml:space="preserve"> </w:t>
+      </w:r>
+      <w:r>
+        <w:t xml:space="preserve">: le téléphone chargé, la fiche prospect ouverte, deux ou trois exemples de fiches produits déjà en ligne chez d'autres vendeurs, et rien d'autre. Pas de dossier imprimé à la première visite.</w:t>
       </w:r>
     </w:p>
     <w:p>
@@ -627,7 +667,51 @@
         <w:pStyle w:val="Compact"/>
         <w:numPr>
           <w:ilvl w:val="0"/>
-          <w:numId w:val="1003"/>
+          <w:numId w:val="1004"/>
+        </w:numPr>
+      </w:pPr>
+      <w:r>
+        <w:rPr>
+          <w:b/>
+          <w:bCs/>
+        </w:rPr>
+        <w:t xml:space="preserve">Qui décide</w:t>
+      </w:r>
+      <w:r>
+        <w:t xml:space="preserve"> </w:t>
+      </w:r>
+      <w:r>
+        <w:t xml:space="preserve">: dans un magasin indépendant, c'est le propriétaire, presque jamais le vendeur au comptoir. Si le patron n'est pas là, on ne fait pas la présentation complète : on prend son nom, son heure de présence, et on revient. Une présentation faite à quelqu'un qui ne décide pas est une présentation à refaire.</w:t>
+      </w:r>
+    </w:p>
+    <w:p>
+      <w:pPr>
+        <w:pStyle w:val="Compact"/>
+        <w:numPr>
+          <w:ilvl w:val="0"/>
+          <w:numId w:val="1004"/>
+        </w:numPr>
+      </w:pPr>
+      <w:r>
+        <w:rPr>
+          <w:b/>
+          <w:bCs/>
+        </w:rPr>
+        <w:t xml:space="preserve">Horaires utiles</w:t>
+      </w:r>
+      <w:r>
+        <w:t xml:space="preserve"> </w:t>
+      </w:r>
+      <w:r>
+        <w:t xml:space="preserve">: à Adjamé et Treichville, entre 7 h 30 et 10 h le patron est présent et le magasin n'est pas encore saturé. Après 11 h, on parle à un homme qui sert trois clients en même temps.</w:t>
+      </w:r>
+    </w:p>
+    <w:p>
+      <w:pPr>
+        <w:pStyle w:val="Compact"/>
+        <w:numPr>
+          <w:ilvl w:val="0"/>
+          <w:numId w:val="1004"/>
         </w:numPr>
       </w:pPr>
       <w:r>
@@ -1705,7 +1789,7 @@
         <w:t xml:space="preserve"> </w:t>
       </w:r>
       <w:r>
-        <w:t xml:space="preserve">— « Vous savez donc déjà que la publicité amène des curieux, pas des commandes. Nous, on amène un acheteur qui a déjà choisi sa pièce, vérifié la compatibilité avec son véhicule, et payé. »</w:t>
+        <w:t xml:space="preserve">— « Vous savez donc déjà que la publicité amène des curieux, pas des commandes. Nous, on ne vous amène pas un curieux : on vous amène une commande déjà payée, pour une référence choisie et vérifiée sur le véhicule. Vous sortez la pièce, on passe la prendre, on livre. »</w:t>
       </w:r>
     </w:p>
     <w:p>
@@ -1986,7 +2070,7 @@
               <w:pStyle w:val="Compact"/>
             </w:pPr>
             <w:r>
-              <w:t xml:space="preserve">C'est notre agent qui saisit. Il vient, photographie, décrit, publie. Vous validez.</w:t>
+              <w:t xml:space="preserve">C'est notre agent qui saisit au démarrage : il vient, photographie, décrit, publie, vous validez. Ensuite, pour vos nouveaux arrivages, on forme un de vos employés — une demi-heure, sur son téléphone, il photographie et publie lui-même.</w:t>
             </w:r>
             <w:r>
               <w:t xml:space="preserve"> </w:t>
@@ -2002,7 +2086,7 @@
               <w:t xml:space="preserve"> </w:t>
             </w:r>
             <w:r>
-              <w:t xml:space="preserve">on commence par combien de références — dix, pour voir ?</w:t>
+              <w:t xml:space="preserve">qui, chez vous, pourrait prendre ça en main ? On commence par dix références ?</w:t>
             </w:r>
           </w:p>
         </w:tc>
@@ -2114,7 +2198,7 @@
               <w:pStyle w:val="Compact"/>
             </w:pPr>
             <w:r>
-              <w:t xml:space="preserve">Facebook vous amène des gens qui demandent le prix et disparaissent. Chez nous, l'acheteur arrive après avoir vérifié la compatibilité et payé. Ce n'est pas le même client.</w:t>
+              <w:t xml:space="preserve">Facebook vous amène des gens qui demandent le prix et disparaissent. Chez nous, ce n'est pas un curieux qui vous appelle : c'est une commande déjà payée qui vous arrive, référence et véhicule vérifiés. Et vous n'avez ni à discuter avec le client, ni à le livrer.</w:t>
             </w:r>
           </w:p>
         </w:tc>
@@ -2235,13 +2319,93 @@
             </w:pPr>
             <w:r>
               <w:t xml:space="preserve">Vous gardez vos clients, votre magasin, vos prix et votre stock. Nous ne sommes qu'un canal de plus — et vous pouvez le couper quand vous voulez.</w:t>
+            </w:r>
+          </w:p>
+        </w:tc>
+      </w:tr>
+      <w:tr>
+        <w:tc>
+          <w:tcPr/>
+          <w:p>
+            <w:pPr>
+              <w:pStyle w:val="Compact"/>
+            </w:pPr>
+            <w:r>
+              <w:t xml:space="preserve">« Et la livraison, c'est moi qui la fais ? »</w:t>
+            </w:r>
+          </w:p>
+        </w:tc>
+        <w:tc>
+          <w:tcPr/>
+          <w:p>
+            <w:pPr>
+              <w:pStyle w:val="Compact"/>
+            </w:pPr>
+            <w:r>
+              <w:t xml:space="preserve">Non. Vous préparez la pièce, nous venons la prendre et nous livrons le client. Vous n'avez ni livreur à payer, ni course à faire, ni rendez-vous à honorer.</w:t>
+            </w:r>
+            <w:r>
+              <w:t xml:space="preserve"> </w:t>
+            </w:r>
+            <w:r>
+              <w:rPr>
+                <w:i/>
+                <w:iCs/>
+              </w:rPr>
+              <w:t xml:space="preserve">Relancer :</w:t>
+            </w:r>
+            <w:r>
+              <w:t xml:space="preserve"> </w:t>
+            </w:r>
+            <w:r>
+              <w:t xml:space="preserve">aujourd'hui, combien vous coûte une course pour porter une pièce à Yopougon ?</w:t>
+            </w:r>
+          </w:p>
+        </w:tc>
+      </w:tr>
+      <w:tr>
+        <w:tc>
+          <w:tcPr/>
+          <w:p>
+            <w:pPr>
+              <w:pStyle w:val="Compact"/>
+            </w:pPr>
+            <w:r>
+              <w:t xml:space="preserve">« Je ne vous connais pas, vous n'existez pas encore »</w:t>
+            </w:r>
+          </w:p>
+        </w:tc>
+        <w:tc>
+          <w:tcPr/>
+          <w:p>
+            <w:pPr>
+              <w:pStyle w:val="Compact"/>
+            </w:pPr>
+            <w:r>
+              <w:t xml:space="preserve">C'est exact, et c'est justement le moment : nous ouvrons dans les trente jours. Les vendeurs qui entrent maintenant sont ceux dont le stock est en ligne le premier jour, quand toute la demande arrive sur un catalogue encore court. Ceux qui viendront après entreront dans un catalogue déjà rempli.</w:t>
+            </w:r>
+            <w:r>
+              <w:t xml:space="preserve"> </w:t>
+            </w:r>
+            <w:r>
+              <w:rPr>
+                <w:i/>
+                <w:iCs/>
+              </w:rPr>
+              <w:t xml:space="preserve">Relancer :</w:t>
+            </w:r>
+            <w:r>
+              <w:t xml:space="preserve"> </w:t>
+            </w:r>
+            <w:r>
+              <w:t xml:space="preserve">vous préférez être parmi les premiers, ou attendre de voir la place que les autres auront prise ?</w:t>
             </w:r>
           </w:p>
         </w:tc>
       </w:tr>
     </w:tbl>
     <w:bookmarkEnd w:id="31"/>
-    <w:bookmarkStart w:id="35" w:name="X80fe828a00f5b760253063a128e26775f8c7b3e"/>
+    <w:bookmarkStart w:id="36" w:name="X80fe828a00f5b760253063a128e26775f8c7b3e"/>
     <w:p>
       <w:pPr>
         <w:pStyle w:val="Heading2"/>
@@ -2264,7 +2428,7 @@
         <w:pStyle w:val="Compact"/>
         <w:numPr>
           <w:ilvl w:val="0"/>
-          <w:numId w:val="1004"/>
+          <w:numId w:val="1005"/>
         </w:numPr>
       </w:pPr>
       <w:r>
@@ -2286,7 +2450,7 @@
         <w:pStyle w:val="Compact"/>
         <w:numPr>
           <w:ilvl w:val="0"/>
-          <w:numId w:val="1004"/>
+          <w:numId w:val="1005"/>
         </w:numPr>
       </w:pPr>
       <w:r>
@@ -2308,7 +2472,7 @@
         <w:pStyle w:val="Compact"/>
         <w:numPr>
           <w:ilvl w:val="0"/>
-          <w:numId w:val="1004"/>
+          <w:numId w:val="1005"/>
         </w:numPr>
       </w:pPr>
       <w:r>
@@ -2327,7 +2491,7 @@
         <w:pStyle w:val="Compact"/>
         <w:numPr>
           <w:ilvl w:val="0"/>
-          <w:numId w:val="1004"/>
+          <w:numId w:val="1005"/>
         </w:numPr>
       </w:pPr>
       <w:r>
@@ -2343,7 +2507,7 @@
         <w:pStyle w:val="Compact"/>
         <w:numPr>
           <w:ilvl w:val="0"/>
-          <w:numId w:val="1004"/>
+          <w:numId w:val="1005"/>
         </w:numPr>
       </w:pPr>
       <w:r>
@@ -2392,7 +2556,123 @@
       </w:r>
     </w:p>
     <w:bookmarkEnd w:id="32"/>
-    <w:bookmarkStart w:id="33" w:name="X575bd95b7b0a7ba75d1c52d2e0d3ca4e78bb750"/>
+    <w:bookmarkStart w:id="33" w:name="le-contexte-de-prélancement"/>
+    <w:p>
+      <w:pPr>
+        <w:pStyle w:val="Heading3"/>
+      </w:pPr>
+      <w:r>
+        <w:t xml:space="preserve">Le contexte de prélancement</w:t>
+      </w:r>
+    </w:p>
+    <w:p>
+      <w:pPr>
+        <w:pStyle w:val="FirstParagraph"/>
+      </w:pPr>
+      <w:r>
+        <w:rPr>
+          <w:b/>
+          <w:bCs/>
+        </w:rPr>
+        <w:t xml:space="preserve">Pièces ouvre dans les trente jours.</w:t>
+      </w:r>
+      <w:r>
+        <w:t xml:space="preserve"> </w:t>
+      </w:r>
+      <w:r>
+        <w:t xml:space="preserve">Ce n'est pas une information qu'on cache : c'est le cadre de toute la conversation de closing. On ne vend pas des résultats passés — il n'y en a pas encore —</w:t>
+      </w:r>
+      <w:r>
+        <w:t xml:space="preserve"> </w:t>
+      </w:r>
+      <w:r>
+        <w:rPr>
+          <w:b/>
+          <w:bCs/>
+        </w:rPr>
+        <w:t xml:space="preserve">on vend une place à l'ouverture</w:t>
+      </w:r>
+      <w:r>
+        <w:t xml:space="preserve">. Deux conséquences directes :</w:t>
+      </w:r>
+    </w:p>
+    <w:p>
+      <w:pPr>
+        <w:pStyle w:val="Compact"/>
+        <w:numPr>
+          <w:ilvl w:val="0"/>
+          <w:numId w:val="1006"/>
+        </w:numPr>
+      </w:pPr>
+      <w:r>
+        <w:rPr>
+          <w:b/>
+          <w:bCs/>
+        </w:rPr>
+        <w:t xml:space="preserve">On ne propose jamais « d'observer pendant quinze jours ».</w:t>
+      </w:r>
+      <w:r>
+        <w:t xml:space="preserve"> </w:t>
+      </w:r>
+      <w:r>
+        <w:t xml:space="preserve">Il n'y a pas encore de ventes à observer, et un rendez-vous de bilan à quinze jours serait démenti par les faits. La date qu'on pose en sortie de visite, c'est</w:t>
+      </w:r>
+      <w:r>
+        <w:t xml:space="preserve"> </w:t>
+      </w:r>
+      <w:r>
+        <w:rPr>
+          <w:b/>
+          <w:bCs/>
+        </w:rPr>
+        <w:t xml:space="preserve">le jour de la mise en ligne</w:t>
+      </w:r>
+      <w:r>
+        <w:t xml:space="preserve">, pas un bilan de résultats.</w:t>
+      </w:r>
+    </w:p>
+    <w:p>
+      <w:pPr>
+        <w:pStyle w:val="Compact"/>
+        <w:numPr>
+          <w:ilvl w:val="0"/>
+          <w:numId w:val="1006"/>
+        </w:numPr>
+      </w:pPr>
+      <w:r>
+        <w:rPr>
+          <w:b/>
+          <w:bCs/>
+        </w:rPr>
+        <w:t xml:space="preserve">On vend la primauté.</w:t>
+      </w:r>
+      <w:r>
+        <w:t xml:space="preserve"> </w:t>
+      </w:r>
+      <w:r>
+        <w:t xml:space="preserve">Être présent au lancement, c'est avoir son stock dans le catalogue du premier jour, apparaître en tête des recherches quand la demande arrive sur un catalogue encore court, et être cité dans la campagne d'ouverture.</w:t>
+      </w:r>
+    </w:p>
+    <w:p>
+      <w:pPr>
+        <w:pStyle w:val="FirstParagraph"/>
+      </w:pPr>
+      <w:r>
+        <w:t xml:space="preserve">La phrase de positionnement, à dire telle quelle :</w:t>
+      </w:r>
+      <w:r>
+        <w:t xml:space="preserve"> </w:t>
+      </w:r>
+      <w:r>
+        <w:rPr>
+          <w:b/>
+          <w:bCs/>
+        </w:rPr>
+        <w:t xml:space="preserve">« Nous construisons le Jumia des pièces détachées, pour les professionnels comme pour les particuliers. Le jour de l'ouverture, il n'y aura qu'une poignée de grossistes en ligne. La seule question, c'est de savoir si vous en faites partie. »</w:t>
+      </w:r>
+    </w:p>
+    <w:bookmarkEnd w:id="33"/>
+    <w:bookmarkStart w:id="34" w:name="X575bd95b7b0a7ba75d1c52d2e0d3ca4e78bb750"/>
     <w:p>
       <w:pPr>
         <w:pStyle w:val="Heading3"/>
@@ -2481,24 +2761,24 @@
                 <w:b/>
                 <w:bCs/>
               </w:rPr>
-              <w:t xml:space="preserve">Essai sur 10 références</w:t>
+              <w:t xml:space="preserve">Dix références pour l'ouverture</w:t>
             </w:r>
             <w:r>
               <w:t xml:space="preserve"> </w:t>
             </w:r>
             <w:r>
-              <w:t xml:space="preserve">— le vendeur choisit dix pièces, on les publie, il observe</w:t>
-            </w:r>
-          </w:p>
-        </w:tc>
-        <w:tc>
-          <w:tcPr/>
-          <w:p>
-            <w:pPr>
-              <w:pStyle w:val="Compact"/>
-            </w:pPr>
-            <w:r>
-              <w:t xml:space="preserve">« On prend dix pièces que vous voulez faire bouger, on les met en ligne cette semaine, et on se revoit dans quinze jours avec les résultats. D'accord ? »</w:t>
+              <w:t xml:space="preserve">— le vendeur choisit dix pièces, on les publie, elles sont dans le catalogue du premier jour</w:t>
+            </w:r>
+          </w:p>
+        </w:tc>
+        <w:tc>
+          <w:tcPr/>
+          <w:p>
+            <w:pPr>
+              <w:pStyle w:val="Compact"/>
+            </w:pPr>
+            <w:r>
+              <w:t xml:space="preserve">« On prend dix pièces que vous voulez faire bouger, on les met en ligne cette semaine : elles seront là le jour de l'ouverture, dans le premier catalogue que les acheteurs verront. On commence par lesquelles ? »</w:t>
             </w:r>
           </w:p>
         </w:tc>
@@ -2599,11 +2879,24 @@
         <w:pStyle w:val="BodyText"/>
       </w:pPr>
       <w:r>
-        <w:t xml:space="preserve">Le niveau 1 est le bon objectif par défaut à la première visite. Un vendeur qui refuse dix références refusera un contrat.</w:t>
-      </w:r>
-    </w:p>
-    <w:bookmarkEnd w:id="33"/>
-    <w:bookmarkStart w:id="34" w:name="ce-quon-ne-promet-jamais"/>
+        <w:t xml:space="preserve">Le niveau 1 est le bon objectif par défaut à la première visite. Un vendeur qui refuse dix références refusera un contrat. Et comme il n'y a rien à montrer avant l'ouverture, la relance qu'on programme n'est pas « on se revoit pour voir les résultats » : c'est</w:t>
+      </w:r>
+      <w:r>
+        <w:t xml:space="preserve"> </w:t>
+      </w:r>
+      <w:r>
+        <w:rPr>
+          <w:b/>
+          <w:bCs/>
+        </w:rPr>
+        <w:t xml:space="preserve">l'appel du jour de la mise en ligne</w:t>
+      </w:r>
+      <w:r>
+        <w:t xml:space="preserve">, puis celui du lancement.</w:t>
+      </w:r>
+    </w:p>
+    <w:bookmarkEnd w:id="34"/>
+    <w:bookmarkStart w:id="35" w:name="ce-quon-ne-promet-jamais"/>
     <w:p>
       <w:pPr>
         <w:pStyle w:val="Heading3"/>
@@ -2633,9 +2926,46 @@
         <w:t xml:space="preserve">, jamais comme une garantie. Et on ne cite jamais de plancher ni de barème de commission : le vendeur fixe, nous constatons.</w:t>
       </w:r>
     </w:p>
-    <w:bookmarkEnd w:id="34"/>
+    <w:p>
+      <w:pPr>
+        <w:pStyle w:val="BodyText"/>
+      </w:pPr>
+      <w:r>
+        <w:t xml:space="preserve">En prélancement, deux interdits s'ajoutent :</w:t>
+      </w:r>
+      <w:r>
+        <w:t xml:space="preserve"> </w:t>
+      </w:r>
+      <w:r>
+        <w:rPr>
+          <w:b/>
+          <w:bCs/>
+        </w:rPr>
+        <w:t xml:space="preserve">aucune promesse de ventes ou de volume à l'ouverture</w:t>
+      </w:r>
+      <w:r>
+        <w:t xml:space="preserve"> </w:t>
+      </w:r>
+      <w:r>
+        <w:t xml:space="preserve">— la primauté est une position, pas un chiffre d'affaires annoncé — et</w:t>
+      </w:r>
+      <w:r>
+        <w:t xml:space="preserve"> </w:t>
+      </w:r>
+      <w:r>
+        <w:rPr>
+          <w:b/>
+          <w:bCs/>
+        </w:rPr>
+        <w:t xml:space="preserve">aucune date de lancement au jour près</w:t>
+      </w:r>
+      <w:r>
+        <w:t xml:space="preserve">. On dit « dans les trente jours », rien de plus précis.</w:t>
+      </w:r>
+    </w:p>
     <w:bookmarkEnd w:id="35"/>
-    <w:bookmarkStart w:id="36" w:name="Xc0a105b46f436379a6831d673464c949d7ba682"/>
+    <w:bookmarkEnd w:id="36"/>
+    <w:bookmarkStart w:id="37" w:name="Xc0a105b46f436379a6831d673464c949d7ba682"/>
     <w:p>
       <w:pPr>
         <w:pStyle w:val="Heading2"/>
@@ -2864,6 +3194,30 @@
               <w:pStyle w:val="Compact"/>
             </w:pPr>
             <w:r>
+              <w:t xml:space="preserve">Employé désigné pour la saisie</w:t>
+            </w:r>
+          </w:p>
+        </w:tc>
+        <w:tc>
+          <w:tcPr/>
+          <w:p>
+            <w:pPr>
+              <w:pStyle w:val="Compact"/>
+            </w:pPr>
+            <w:r>
+              <w:t xml:space="preserve">Nom et téléphone de celui qui publiera les arrivages après le passage de l'agent</w:t>
+            </w:r>
+          </w:p>
+        </w:tc>
+      </w:tr>
+      <w:tr>
+        <w:tc>
+          <w:tcPr/>
+          <w:p>
+            <w:pPr>
+              <w:pStyle w:val="Compact"/>
+            </w:pPr>
+            <w:r>
               <w:t xml:space="preserve">Livre-t-il ? Vend-il déjà en ligne ?</w:t>
             </w:r>
           </w:p>
@@ -2987,7 +3341,7 @@
               <w:pStyle w:val="Compact"/>
             </w:pPr>
             <w:r>
-              <w:t xml:space="preserve">Essai 10 références / mandat Liaison / contrat signé / nouveau rendez-vous / refus</w:t>
+              <w:t xml:space="preserve">Dix références pour l'ouverture / mandat Liaison / contrat signé / nouveau rendez-vous / refus</w:t>
             </w:r>
           </w:p>
         </w:tc>
@@ -3041,8 +3395,8 @@
         </w:tc>
       </w:tr>
     </w:tbl>
-    <w:bookmarkEnd w:id="36"/>
-    <w:bookmarkStart w:id="37" w:name="Xb8e163bd62910f848a772efd1f73bebe2751d7f"/>
+    <w:bookmarkEnd w:id="37"/>
+    <w:bookmarkStart w:id="38" w:name="Xb8e163bd62910f848a772efd1f73bebe2751d7f"/>
     <w:p>
       <w:pPr>
         <w:pStyle w:val="Heading2"/>
@@ -3056,7 +3410,7 @@
         <w:pStyle w:val="FirstParagraph"/>
       </w:pPr>
       <w:r>
-        <w:t xml:space="preserve">Le relais opérationnel se prend en trois gestes, dans cet ordre :</w:t>
+        <w:t xml:space="preserve">Le relais opérationnel se prend en quatre gestes, dans cet ordre :</w:t>
       </w:r>
       <w:r>
         <w:t xml:space="preserve"> </w:t>
@@ -3104,7 +3458,23 @@
         <w:t xml:space="preserve"> </w:t>
       </w:r>
       <w:r>
-        <w:t xml:space="preserve">pour la saisie des premières pièces. Le contrat d'adhésion se signe en ligne, par lien, avec le nom du signataire et une case d'acceptation — il n'y a rien à imprimer.</w:t>
+        <w:t xml:space="preserve">pour la saisie des premières pièces, puis</w:t>
+      </w:r>
+      <w:r>
+        <w:t xml:space="preserve"> </w:t>
+      </w:r>
+      <w:r>
+        <w:rPr>
+          <w:b/>
+          <w:bCs/>
+        </w:rPr>
+        <w:t xml:space="preserve">formation de l'employé désigné</w:t>
+      </w:r>
+      <w:r>
+        <w:t xml:space="preserve"> </w:t>
+      </w:r>
+      <w:r>
+        <w:t xml:space="preserve">par le vendeur, qui publiera les arrivages suivants. Le nom de cet employé se note dès la visite : sans lui, le catalogue s'arrête au jour du passage de l'agent. Le contrat d'adhésion se signe en ligne, par lien, avec le nom du signataire et une case d'acceptation — il n'y a rien à imprimer.</w:t>
       </w:r>
     </w:p>
     <w:p>
@@ -3112,7 +3482,7 @@
         <w:pStyle w:val="BodyText"/>
       </w:pPr>
       <w:r>
-        <w:t xml:space="preserve">À partir de là, le vendeur reçoit ses commandes par WhatsApp, confirme, prépare, et se fait reverser après livraison. Notre travail commercial n'est pas fini pour autant :</w:t>
+        <w:t xml:space="preserve">À partir de là, Pièces lui transmet ses commandes par WhatsApp — déjà payées — il confirme et prépare la pièce ; nous l'enlevons, nous livrons le client, et il est reversé après confirmation de livraison. Notre travail commercial n'est pas fini pour autant :</w:t>
       </w:r>
       <w:r>
         <w:t xml:space="preserve"> </w:t>
@@ -3125,7 +3495,39 @@
         <w:t xml:space="preserve">la première vente est l'événement qui convertit vraiment</w:t>
       </w:r>
       <w:r>
-        <w:t xml:space="preserve">. Un vendeur inscrit sans première vente sous quinze jours est un vendeur perdu — c'est le seul indicateur de suivi qui compte après la signature.</w:t>
+        <w:t xml:space="preserve">. Avant l'ouverture, le seul indicateur qui compte est le</w:t>
+      </w:r>
+      <w:r>
+        <w:t xml:space="preserve"> </w:t>
+      </w:r>
+      <w:r>
+        <w:rPr>
+          <w:b/>
+          <w:bCs/>
+        </w:rPr>
+        <w:t xml:space="preserve">nombre de références réellement en ligne</w:t>
+      </w:r>
+      <w:r>
+        <w:t xml:space="preserve"> </w:t>
+      </w:r>
+      <w:r>
+        <w:t xml:space="preserve">par vendeur signé ; après l'ouverture, c'est la</w:t>
+      </w:r>
+      <w:r>
+        <w:t xml:space="preserve"> </w:t>
+      </w:r>
+      <w:r>
+        <w:rPr>
+          <w:b/>
+          <w:bCs/>
+        </w:rPr>
+        <w:t xml:space="preserve">première vente sous quinze jours</w:t>
+      </w:r>
+      <w:r>
+        <w:t xml:space="preserve"> </w:t>
+      </w:r>
+      <w:r>
+        <w:t xml:space="preserve">— un vendeur qui ne l'a pas faite est un vendeur perdu.</w:t>
       </w:r>
     </w:p>
     <w:p>
@@ -3147,9 +3549,13 @@
         <w:t xml:space="preserve">Document interne Pièces — Direction commerciale. Chiffres de marché issus de l'étude sur les coûts d'exploitation VTC en Côte d'Ivoire ; clauses citées issues du contrat d'adhésion vendeur en vigueur. À utiliser avec le classeur de prospection « prospection-vendeurs-2026-08.xlsx ».</w:t>
       </w:r>
     </w:p>
-    <w:bookmarkEnd w:id="37"/>
     <w:bookmarkEnd w:id="38"/>
-    <w:sectPr/>
+    <w:bookmarkEnd w:id="39"/>
+    <w:sectPr>
+      <w:footnotePr>
+        <w:numRestart w:val="eachSect"/>
+      </w:footnotePr>
+    </w:sectPr>
   </w:body>
 </w:document>
 </file>
@@ -3373,6 +3779,12 @@
   <w:num w:numId="1004">
     <w:abstractNumId w:val="991"/>
   </w:num>
+  <w:num w:numId="1005">
+    <w:abstractNumId w:val="991"/>
+  </w:num>
+  <w:num w:numId="1006">
+    <w:abstractNumId w:val="991"/>
+  </w:num>
 </w:numbering>
 </file>
 
@@ -3436,8 +3848,6 @@
     </w:pPr>
     <w:rPr>
       <w:rFonts w:asciiTheme="majorHAnsi" w:cstheme="majorBidi" w:eastAsiaTheme="majorEastAsia" w:hAnsiTheme="majorHAnsi"/>
-      <w:spacing w:val="-10"/>
-      <w:kern w:val="28"/>
       <w:sz w:val="56"/>
       <w:szCs w:val="56"/>
     </w:rPr>
@@ -3450,8 +3860,6 @@
     <w:rsid w:val="00A10FD9"/>
     <w:rPr>
       <w:rFonts w:asciiTheme="majorHAnsi" w:cstheme="majorBidi" w:eastAsiaTheme="majorEastAsia" w:hAnsiTheme="majorHAnsi"/>
-      <w:spacing w:val="-10"/>
-      <w:kern w:val="28"/>
       <w:sz w:val="56"/>
       <w:szCs w:val="56"/>
     </w:rPr>
@@ -3492,23 +3900,31 @@
   </w:style>
   <w:style w:customStyle="1" w:styleId="Author" w:type="paragraph">
     <w:name w:val="Author"/>
+    <w:basedOn w:val="Title"/>
     <w:next w:val="BodyText"/>
     <w:qFormat/>
     <w:pPr>
       <w:keepNext/>
       <w:keepLines/>
-      <w:jc w:val="center"/>
     </w:pPr>
+    <w:rPr>
+      <w:sz w:val="24"/>
+      <w:szCs w:val="24"/>
+    </w:rPr>
   </w:style>
   <w:style w:styleId="Date" w:type="paragraph">
     <w:name w:val="Date"/>
+    <w:basedOn w:val="Title"/>
     <w:next w:val="BodyText"/>
     <w:qFormat/>
     <w:pPr>
       <w:keepNext/>
       <w:keepLines/>
-      <w:jc w:val="center"/>
     </w:pPr>
+    <w:rPr>
+      <w:sz w:val="24"/>
+      <w:szCs w:val="24"/>
+    </w:rPr>
   </w:style>
   <w:style w:customStyle="1" w:styleId="AbstractTitle" w:type="paragraph">
     <w:name w:val="Abstract Title"/>

</xml_diff>

<commit_message>
docs(commercial): corrige le circuit de paiement dans la bible de démarchage
La pièce est enlevée avant tout encaissement : le livreur encaisse le client
au moment de la remise, et l'argent du vendeur lui est transmis immédiatement.
Supprime les formulations « commande déjà payée », « l'acheteur paie avant que
la pièce ne parte » et « fonds sous séquestre reversés après confirmation ».

- Promesse et preuves réécrites : rien n'est remis sans être payé, paiement
  du vendeur dans la foulée, retour de la pièce si le client ne paie pas.
- Troisième formulation à bannir : « la commande est déjà payée quand on vient
  chercher la pièce ».
- Nouvelle objection « Vous partez avec ma pièce sans me payer » : le risque
  d'enlèvement est porté par Pièces, deux issues seulement.
- Commission prélevée sur l'encaissement à la livraison, plus au reversement.

Co-Authored-By: Claude Opus 5 (1M context) <noreply@anthropic.com>
Claude-Session: https://claude.ai/code/session_01RASqV7Cvww6ZeGGcmp3QmQ
</commit_message>
<xml_diff>
--- a/docs/guide-prospection-vendeurs-2026-08.docx
+++ b/docs/guide-prospection-vendeurs-2026-08.docx
@@ -417,7 +417,7 @@
           <w:b/>
           <w:bCs/>
         </w:rPr>
-        <w:t xml:space="preserve">« Un agent vient chez vous, photographie votre stock, le publie en ligne. Nous vous apportons les commandes déjà payées, et c'est nous qui livrons. Vous ne changez rien à votre façon de travailler. »</w:t>
+        <w:t xml:space="preserve">« Un agent vient chez vous, photographie votre stock, le publie en ligne. Nous passons prendre la pièce, nous encaissons le client à la livraison, et nous vous transmettons votre argent immédiatement. »</w:t>
       </w:r>
     </w:p>
     <w:p>
@@ -536,13 +536,52 @@
           <w:b/>
           <w:bCs/>
         </w:rPr>
-        <w:t xml:space="preserve">Le paiement est sécurisé.</w:t>
-      </w:r>
-      <w:r>
-        <w:t xml:space="preserve"> </w:t>
-      </w:r>
-      <w:r>
-        <w:t xml:space="preserve">L'acheteur paie Pièces, l'argent est conservé sous séquestre, et reversé au vendeur après confirmation de livraison. Le vendeur ne court pas après son client.</w:t>
+        <w:t xml:space="preserve">La pièce n'est jamais remise sans être payée.</w:t>
+      </w:r>
+      <w:r>
+        <w:t xml:space="preserve"> </w:t>
+      </w:r>
+      <w:r>
+        <w:t xml:space="preserve">C'est le cœur de la proposition, et il faut le dire dans cet ordre exact : nous passons</w:t>
+      </w:r>
+      <w:r>
+        <w:t xml:space="preserve"> </w:t>
+      </w:r>
+      <w:r>
+        <w:rPr>
+          <w:b/>
+          <w:bCs/>
+        </w:rPr>
+        <w:t xml:space="preserve">prendre la pièce</w:t>
+      </w:r>
+      <w:r>
+        <w:t xml:space="preserve">, notre livreur</w:t>
+      </w:r>
+      <w:r>
+        <w:t xml:space="preserve"> </w:t>
+      </w:r>
+      <w:r>
+        <w:rPr>
+          <w:b/>
+          <w:bCs/>
+        </w:rPr>
+        <w:t xml:space="preserve">encaisse le client au moment de la remise</w:t>
+      </w:r>
+      <w:r>
+        <w:t xml:space="preserve">, et</w:t>
+      </w:r>
+      <w:r>
+        <w:t xml:space="preserve"> </w:t>
+      </w:r>
+      <w:r>
+        <w:rPr>
+          <w:b/>
+          <w:bCs/>
+        </w:rPr>
+        <w:t xml:space="preserve">votre argent vous est transmis immédiatement</w:t>
+      </w:r>
+      <w:r>
+        <w:t xml:space="preserve">. Pas de livraison à crédit, pas de « je vous règle la semaine prochaine », pas de délai de reversement à attendre. Si le client ne paie pas, il n'a pas la pièce : elle revient chez vous.</w:t>
       </w:r>
     </w:p>
     <w:p>
@@ -574,7 +613,7 @@
           <w:b/>
           <w:bCs/>
         </w:rPr>
-        <w:t xml:space="preserve">C'est Pièces qui transmet la commande — déjà payée, avec la référence et le véhicule — et c'est Pièces qui livre.</w:t>
+        <w:t xml:space="preserve">C'est Pièces qui transmet la commande — référence et véhicule vérifiés — et c'est Pièces qui l'enlève, l'encaisse et la livre.</w:t>
       </w:r>
       <w:r>
         <w:t xml:space="preserve"> </w:t>
@@ -592,7 +631,7 @@
           <w:b/>
           <w:bCs/>
         </w:rPr>
-        <w:t xml:space="preserve">Deux formulations à bannir</w:t>
+        <w:t xml:space="preserve">Trois formulations à bannir</w:t>
       </w:r>
       <w:r>
         <w:t xml:space="preserve">, parce qu'elles créent une déception à la première commande :</w:t>
@@ -620,6 +659,60 @@
       </w:pPr>
       <w:r>
         <w:t xml:space="preserve">« un agent passera à chaque arrivage » — non : l'agent lance le catalogue, l'équipe du magasin l'entretient ensuite.</w:t>
+      </w:r>
+    </w:p>
+    <w:p>
+      <w:pPr>
+        <w:pStyle w:val="Compact"/>
+        <w:numPr>
+          <w:ilvl w:val="0"/>
+          <w:numId w:val="1003"/>
+        </w:numPr>
+      </w:pPr>
+      <w:r>
+        <w:t xml:space="preserve">« la commande est déjà payée quand on vient chercher la pièce » — non, et c'est important :</w:t>
+      </w:r>
+      <w:r>
+        <w:t xml:space="preserve"> </w:t>
+      </w:r>
+      <w:r>
+        <w:rPr>
+          <w:b/>
+          <w:bCs/>
+        </w:rPr>
+        <w:t xml:space="preserve">l'encaissement a lieu à la livraison</w:t>
+      </w:r>
+      <w:r>
+        <w:t xml:space="preserve">, pas à l'enlèvement. Ce qui est vrai, et suffit largement, c'est que</w:t>
+      </w:r>
+      <w:r>
+        <w:t xml:space="preserve"> </w:t>
+      </w:r>
+      <w:r>
+        <w:rPr>
+          <w:b/>
+          <w:bCs/>
+        </w:rPr>
+        <w:t xml:space="preserve">rien ne part chez le client sans être payé</w:t>
+      </w:r>
+      <w:r>
+        <w:t xml:space="preserve"> </w:t>
+      </w:r>
+      <w:r>
+        <w:t xml:space="preserve">et que</w:t>
+      </w:r>
+      <w:r>
+        <w:t xml:space="preserve"> </w:t>
+      </w:r>
+      <w:r>
+        <w:rPr>
+          <w:b/>
+          <w:bCs/>
+        </w:rPr>
+        <w:t xml:space="preserve">le vendeur est payé dans la foulée</w:t>
+      </w:r>
+      <w:r>
+        <w:t xml:space="preserve">.</w:t>
       </w:r>
     </w:p>
     <w:bookmarkEnd w:id="21"/>
@@ -1637,7 +1730,7 @@
               <w:pStyle w:val="Compact"/>
             </w:pPr>
             <w:r>
-              <w:t xml:space="preserve">Condition pratique du reversement</w:t>
+              <w:t xml:space="preserve">Par quel canal on lui transmettra son argent après l'encaissement</w:t>
             </w:r>
           </w:p>
         </w:tc>
@@ -1671,7 +1764,7 @@
               <w:t xml:space="preserve"> </w:t>
             </w:r>
             <w:r>
-              <w:t xml:space="preserve">: il ouvre directement sur le paiement sécurisé</w:t>
+              <w:t xml:space="preserve">: il ouvre directement sur « rien ne part sans être payé, et vous êtes payé tout de suite »</w:t>
             </w:r>
           </w:p>
         </w:tc>
@@ -1753,7 +1846,7 @@
         <w:t xml:space="preserve"> </w:t>
       </w:r>
       <w:r>
-        <w:t xml:space="preserve">— « Chez nous, l'acheteur paie avant que la pièce ne parte. L'argent est conservé, et vous est reversé une fois la livraison confirmée. Vous ne courez plus après personne. »</w:t>
+        <w:t xml:space="preserve">— « Chez nous, aucune pièce n'est remise sans être payée : notre livreur encaisse avant de la lâcher, et votre argent vous est transmis immédiatement. Vous ne courez plus après personne, et vous n'attendez pas la fin du mois. »</w:t>
       </w:r>
     </w:p>
     <w:p>
@@ -1789,7 +1882,7 @@
         <w:t xml:space="preserve"> </w:t>
       </w:r>
       <w:r>
-        <w:t xml:space="preserve">— « Vous savez donc déjà que la publicité amène des curieux, pas des commandes. Nous, on ne vous amène pas un curieux : on vous amène une commande déjà payée, pour une référence choisie et vérifiée sur le véhicule. Vous sortez la pièce, on passe la prendre, on livre. »</w:t>
+        <w:t xml:space="preserve">— « Vous savez donc déjà que la publicité amène des curieux, pas des commandes. Nous, on ne vous amène pas un curieux : on vous amène une commande ferme, pour une référence choisie et vérifiée sur le véhicule. Vous sortez la pièce, on passe la prendre, on encaisse à la livraison et on vous paie. »</w:t>
       </w:r>
     </w:p>
     <w:p>
@@ -2110,31 +2203,7 @@
               <w:pStyle w:val="Compact"/>
             </w:pPr>
             <w:r>
-              <w:t xml:space="preserve">Il paie avant. L'argent est conservé par Pièces et vous est reversé après confirmation de livraison. Le risque d'impayé disparaît de votre côté.</w:t>
-            </w:r>
-          </w:p>
-        </w:tc>
-      </w:tr>
-      <w:tr>
-        <w:tc>
-          <w:tcPr/>
-          <w:p>
-            <w:pPr>
-              <w:pStyle w:val="Compact"/>
-            </w:pPr>
-            <w:r>
-              <w:t xml:space="preserve">« Vous prenez combien ? »</w:t>
-            </w:r>
-          </w:p>
-        </w:tc>
-        <w:tc>
-          <w:tcPr/>
-          <w:p>
-            <w:pPr>
-              <w:pStyle w:val="Compact"/>
-            </w:pPr>
-            <w:r>
-              <w:t xml:space="preserve">C'est vous qui fixez la commission, pièce par pièce, au moment de la publication. Nous ne l'imposons pas et il n'y a pas de montant minimum. Elle est prélevée uniquement quand la vente est faite et livrée.</w:t>
+              <w:t xml:space="preserve">Alors il n'a pas la pièce. Notre livreur ne la remet jamais sans encaisser : pas de paiement, pas de livraison — la pièce vous revient. Et dès qu'il paie, votre part vous est transmise immédiatement.</w:t>
             </w:r>
             <w:r>
               <w:t xml:space="preserve"> </w:t>
@@ -2150,199 +2219,55 @@
               <w:t xml:space="preserve"> </w:t>
             </w:r>
             <w:r>
-              <w:t xml:space="preserve">sur une pièce à 25 000 F, vous mettriez combien pour un client que vous n'auriez pas eu autrement ?</w:t>
-            </w:r>
-          </w:p>
-        </w:tc>
-      </w:tr>
-      <w:tr>
-        <w:tc>
-          <w:tcPr/>
-          <w:p>
-            <w:pPr>
-              <w:pStyle w:val="Compact"/>
-            </w:pPr>
-            <w:r>
-              <w:t xml:space="preserve">« Je ne suis pas en règle, je n'ai pas de RCCM »</w:t>
-            </w:r>
-          </w:p>
-        </w:tc>
-        <w:tc>
-          <w:tcPr/>
-          <w:p>
-            <w:pPr>
-              <w:pStyle w:val="Compact"/>
-            </w:pPr>
-            <w:r>
-              <w:t xml:space="preserve">On accepte les vendeurs formels comme informels : une pièce d'identité suffit pour démarrer. La régularisation, on en reparle plus tard, quand le volume la justifie.</w:t>
-            </w:r>
-          </w:p>
-        </w:tc>
-      </w:tr>
-      <w:tr>
-        <w:tc>
-          <w:tcPr/>
-          <w:p>
-            <w:pPr>
-              <w:pStyle w:val="Compact"/>
-            </w:pPr>
-            <w:r>
-              <w:t xml:space="preserve">« J'ai déjà Facebook, ça ne marche pas »</w:t>
-            </w:r>
-          </w:p>
-        </w:tc>
-        <w:tc>
-          <w:tcPr/>
-          <w:p>
-            <w:pPr>
-              <w:pStyle w:val="Compact"/>
-            </w:pPr>
-            <w:r>
-              <w:t xml:space="preserve">Facebook vous amène des gens qui demandent le prix et disparaissent. Chez nous, ce n'est pas un curieux qui vous appelle : c'est une commande déjà payée qui vous arrive, référence et véhicule vérifiés. Et vous n'avez ni à discuter avec le client, ni à le livrer.</w:t>
-            </w:r>
-          </w:p>
-        </w:tc>
-      </w:tr>
-      <w:tr>
-        <w:tc>
-          <w:tcPr/>
-          <w:p>
-            <w:pPr>
-              <w:pStyle w:val="Compact"/>
-            </w:pPr>
-            <w:r>
-              <w:t xml:space="preserve">« Je ne veux pas être exclusif »</w:t>
-            </w:r>
-          </w:p>
-        </w:tc>
-        <w:tc>
-          <w:tcPr/>
-          <w:p>
-            <w:pPr>
-              <w:pStyle w:val="Compact"/>
-            </w:pPr>
-            <w:r>
-              <w:t xml:space="preserve">Le contrat est explicitement non exclusif. Vous continuez à vendre à votre comptoir, sur Facebook, à vos habitués, exactement comme aujourd'hui.</w:t>
-            </w:r>
-          </w:p>
-        </w:tc>
-      </w:tr>
-      <w:tr>
-        <w:tc>
-          <w:tcPr/>
-          <w:p>
-            <w:pPr>
-              <w:pStyle w:val="Compact"/>
-            </w:pPr>
-            <w:r>
-              <w:t xml:space="preserve">« Mes clients me doivent de l'argent, je ne peux pas arrêter le crédit »</w:t>
-            </w:r>
-          </w:p>
-        </w:tc>
-        <w:tc>
-          <w:tcPr/>
-          <w:p>
-            <w:pPr>
-              <w:pStyle w:val="Compact"/>
-            </w:pPr>
-            <w:r>
-              <w:t xml:space="preserve">Personne ne vous le demande. Gardez le crédit pour vos habitués, et servez-vous de la plateforme pour les clients que vous ne connaissez pas — ceux à qui vous n'auriez jamais fait crédit.</w:t>
-            </w:r>
-          </w:p>
-        </w:tc>
-      </w:tr>
-      <w:tr>
-        <w:tc>
-          <w:tcPr/>
-          <w:p>
-            <w:pPr>
-              <w:pStyle w:val="Compact"/>
-            </w:pPr>
-            <w:r>
-              <w:t xml:space="preserve">« Et si le client rend la pièce ? »</w:t>
-            </w:r>
-          </w:p>
-        </w:tc>
-        <w:tc>
-          <w:tcPr/>
-          <w:p>
-            <w:pPr>
-              <w:pStyle w:val="Compact"/>
-            </w:pPr>
-            <w:r>
-              <w:t xml:space="preserve">Retour sous 48 h uniquement si la pièce ne correspond pas à l'annonce, et garantie de bon fonctionnement 30 jours sur ce qui est vendu comme fonctionnel. Une annonce honnête sur l'état vous protège : c'est pour ça que l'état est affiché en gros sur chaque fiche.</w:t>
-            </w:r>
-          </w:p>
-        </w:tc>
-      </w:tr>
-      <w:tr>
-        <w:tc>
-          <w:tcPr/>
-          <w:p>
-            <w:pPr>
-              <w:pStyle w:val="Compact"/>
-            </w:pPr>
-            <w:r>
-              <w:t xml:space="preserve">« Vos garanties, c'est un risque pour moi »</w:t>
-            </w:r>
-          </w:p>
-        </w:tc>
-        <w:tc>
-          <w:tcPr/>
-          <w:p>
-            <w:pPr>
-              <w:pStyle w:val="Compact"/>
-            </w:pPr>
-            <w:r>
-              <w:t xml:space="preserve">Le risque, c'est de vendre une pièce mal décrite. Si la description est juste, le retour n'arrive pas. Et quand un retour est justifié, la commission n'est pas due non plus.</w:t>
-            </w:r>
-          </w:p>
-        </w:tc>
-      </w:tr>
-      <w:tr>
-        <w:tc>
-          <w:tcPr/>
-          <w:p>
-            <w:pPr>
-              <w:pStyle w:val="Compact"/>
-            </w:pPr>
-            <w:r>
-              <w:t xml:space="preserve">« Si tout passe par vous, je deviens dépendant »</w:t>
-            </w:r>
-          </w:p>
-        </w:tc>
-        <w:tc>
-          <w:tcPr/>
-          <w:p>
-            <w:pPr>
-              <w:pStyle w:val="Compact"/>
-            </w:pPr>
-            <w:r>
-              <w:t xml:space="preserve">Vous gardez vos clients, votre magasin, vos prix et votre stock. Nous ne sommes qu'un canal de plus — et vous pouvez le couper quand vous voulez.</w:t>
-            </w:r>
-          </w:p>
-        </w:tc>
-      </w:tr>
-      <w:tr>
-        <w:tc>
-          <w:tcPr/>
-          <w:p>
-            <w:pPr>
-              <w:pStyle w:val="Compact"/>
-            </w:pPr>
-            <w:r>
-              <w:t xml:space="preserve">« Et la livraison, c'est moi qui la fais ? »</w:t>
-            </w:r>
-          </w:p>
-        </w:tc>
-        <w:tc>
-          <w:tcPr/>
-          <w:p>
-            <w:pPr>
-              <w:pStyle w:val="Compact"/>
-            </w:pPr>
-            <w:r>
-              <w:t xml:space="preserve">Non. Vous préparez la pièce, nous venons la prendre et nous livrons le client. Vous n'avez ni livreur à payer, ni course à faire, ni rendez-vous à honorer.</w:t>
+              <w:t xml:space="preserve">aujourd'hui, combien de clients ont votre pièce et pas encore votre argent ?</w:t>
+            </w:r>
+          </w:p>
+        </w:tc>
+      </w:tr>
+      <w:tr>
+        <w:tc>
+          <w:tcPr/>
+          <w:p>
+            <w:pPr>
+              <w:pStyle w:val="Compact"/>
+            </w:pPr>
+            <w:r>
+              <w:t xml:space="preserve">« Vous partez avec ma pièce sans me payer »</w:t>
+            </w:r>
+          </w:p>
+        </w:tc>
+        <w:tc>
+          <w:tcPr/>
+          <w:p>
+            <w:pPr>
+              <w:pStyle w:val="Compact"/>
+            </w:pPr>
+            <w:r>
+              <w:t xml:space="preserve">C'est exact, et c'est nous qui portons ce risque, pas vous : la pièce est tracée à l'enlèvement et sous notre responsabilité jusqu'à la remise. À l'arrivée, il n'y a que deux issues — soit elle est payée et vous recevez votre argent tout de suite, soit elle vous revient. Il n'y a pas de troisième cas.</w:t>
+            </w:r>
+          </w:p>
+        </w:tc>
+      </w:tr>
+      <w:tr>
+        <w:tc>
+          <w:tcPr/>
+          <w:p>
+            <w:pPr>
+              <w:pStyle w:val="Compact"/>
+            </w:pPr>
+            <w:r>
+              <w:t xml:space="preserve">« Vous prenez combien ? »</w:t>
+            </w:r>
+          </w:p>
+        </w:tc>
+        <w:tc>
+          <w:tcPr/>
+          <w:p>
+            <w:pPr>
+              <w:pStyle w:val="Compact"/>
+            </w:pPr>
+            <w:r>
+              <w:t xml:space="preserve">C'est vous qui fixez la commission, pièce par pièce, au moment de la publication. Nous ne l'imposons pas et il n'y a pas de montant minimum. Elle est prélevée uniquement quand la vente est faite et livrée.</w:t>
             </w:r>
             <w:r>
               <w:t xml:space="preserve"> </w:t>
@@ -2358,31 +2283,199 @@
               <w:t xml:space="preserve"> </w:t>
             </w:r>
             <w:r>
-              <w:t xml:space="preserve">aujourd'hui, combien vous coûte une course pour porter une pièce à Yopougon ?</w:t>
-            </w:r>
-          </w:p>
-        </w:tc>
-      </w:tr>
-      <w:tr>
-        <w:tc>
-          <w:tcPr/>
-          <w:p>
-            <w:pPr>
-              <w:pStyle w:val="Compact"/>
-            </w:pPr>
-            <w:r>
-              <w:t xml:space="preserve">« Je ne vous connais pas, vous n'existez pas encore »</w:t>
-            </w:r>
-          </w:p>
-        </w:tc>
-        <w:tc>
-          <w:tcPr/>
-          <w:p>
-            <w:pPr>
-              <w:pStyle w:val="Compact"/>
-            </w:pPr>
-            <w:r>
-              <w:t xml:space="preserve">C'est exact, et c'est justement le moment : nous ouvrons dans les trente jours. Les vendeurs qui entrent maintenant sont ceux dont le stock est en ligne le premier jour, quand toute la demande arrive sur un catalogue encore court. Ceux qui viendront après entreront dans un catalogue déjà rempli.</w:t>
+              <w:t xml:space="preserve">sur une pièce à 25 000 F, vous mettriez combien pour un client que vous n'auriez pas eu autrement ?</w:t>
+            </w:r>
+          </w:p>
+        </w:tc>
+      </w:tr>
+      <w:tr>
+        <w:tc>
+          <w:tcPr/>
+          <w:p>
+            <w:pPr>
+              <w:pStyle w:val="Compact"/>
+            </w:pPr>
+            <w:r>
+              <w:t xml:space="preserve">« Je ne suis pas en règle, je n'ai pas de RCCM »</w:t>
+            </w:r>
+          </w:p>
+        </w:tc>
+        <w:tc>
+          <w:tcPr/>
+          <w:p>
+            <w:pPr>
+              <w:pStyle w:val="Compact"/>
+            </w:pPr>
+            <w:r>
+              <w:t xml:space="preserve">On accepte les vendeurs formels comme informels : une pièce d'identité suffit pour démarrer. La régularisation, on en reparle plus tard, quand le volume la justifie.</w:t>
+            </w:r>
+          </w:p>
+        </w:tc>
+      </w:tr>
+      <w:tr>
+        <w:tc>
+          <w:tcPr/>
+          <w:p>
+            <w:pPr>
+              <w:pStyle w:val="Compact"/>
+            </w:pPr>
+            <w:r>
+              <w:t xml:space="preserve">« J'ai déjà Facebook, ça ne marche pas »</w:t>
+            </w:r>
+          </w:p>
+        </w:tc>
+        <w:tc>
+          <w:tcPr/>
+          <w:p>
+            <w:pPr>
+              <w:pStyle w:val="Compact"/>
+            </w:pPr>
+            <w:r>
+              <w:t xml:space="preserve">Facebook vous amène des gens qui demandent le prix et disparaissent. Chez nous, ce n'est pas un curieux qui vous appelle : c'est une commande ferme, référence et véhicule vérifiés, encaissée à la livraison par notre livreur. Et vous n'avez ni à discuter avec le client, ni à le livrer.</w:t>
+            </w:r>
+          </w:p>
+        </w:tc>
+      </w:tr>
+      <w:tr>
+        <w:tc>
+          <w:tcPr/>
+          <w:p>
+            <w:pPr>
+              <w:pStyle w:val="Compact"/>
+            </w:pPr>
+            <w:r>
+              <w:t xml:space="preserve">« Je ne veux pas être exclusif »</w:t>
+            </w:r>
+          </w:p>
+        </w:tc>
+        <w:tc>
+          <w:tcPr/>
+          <w:p>
+            <w:pPr>
+              <w:pStyle w:val="Compact"/>
+            </w:pPr>
+            <w:r>
+              <w:t xml:space="preserve">Le contrat est explicitement non exclusif. Vous continuez à vendre à votre comptoir, sur Facebook, à vos habitués, exactement comme aujourd'hui.</w:t>
+            </w:r>
+          </w:p>
+        </w:tc>
+      </w:tr>
+      <w:tr>
+        <w:tc>
+          <w:tcPr/>
+          <w:p>
+            <w:pPr>
+              <w:pStyle w:val="Compact"/>
+            </w:pPr>
+            <w:r>
+              <w:t xml:space="preserve">« Mes clients me doivent de l'argent, je ne peux pas arrêter le crédit »</w:t>
+            </w:r>
+          </w:p>
+        </w:tc>
+        <w:tc>
+          <w:tcPr/>
+          <w:p>
+            <w:pPr>
+              <w:pStyle w:val="Compact"/>
+            </w:pPr>
+            <w:r>
+              <w:t xml:space="preserve">Personne ne vous le demande. Gardez le crédit pour vos habitués, et servez-vous de la plateforme pour les clients que vous ne connaissez pas — ceux à qui vous n'auriez jamais fait crédit.</w:t>
+            </w:r>
+          </w:p>
+        </w:tc>
+      </w:tr>
+      <w:tr>
+        <w:tc>
+          <w:tcPr/>
+          <w:p>
+            <w:pPr>
+              <w:pStyle w:val="Compact"/>
+            </w:pPr>
+            <w:r>
+              <w:t xml:space="preserve">« Et si le client rend la pièce ? »</w:t>
+            </w:r>
+          </w:p>
+        </w:tc>
+        <w:tc>
+          <w:tcPr/>
+          <w:p>
+            <w:pPr>
+              <w:pStyle w:val="Compact"/>
+            </w:pPr>
+            <w:r>
+              <w:t xml:space="preserve">Retour sous 48 h uniquement si la pièce ne correspond pas à l'annonce, et garantie de bon fonctionnement 30 jours sur ce qui est vendu comme fonctionnel. Une annonce honnête sur l'état vous protège : c'est pour ça que l'état est affiché en gros sur chaque fiche.</w:t>
+            </w:r>
+          </w:p>
+        </w:tc>
+      </w:tr>
+      <w:tr>
+        <w:tc>
+          <w:tcPr/>
+          <w:p>
+            <w:pPr>
+              <w:pStyle w:val="Compact"/>
+            </w:pPr>
+            <w:r>
+              <w:t xml:space="preserve">« Vos garanties, c'est un risque pour moi »</w:t>
+            </w:r>
+          </w:p>
+        </w:tc>
+        <w:tc>
+          <w:tcPr/>
+          <w:p>
+            <w:pPr>
+              <w:pStyle w:val="Compact"/>
+            </w:pPr>
+            <w:r>
+              <w:t xml:space="preserve">Le risque, c'est de vendre une pièce mal décrite. Si la description est juste, le retour n'arrive pas. Et quand un retour est justifié, la commission n'est pas due non plus.</w:t>
+            </w:r>
+          </w:p>
+        </w:tc>
+      </w:tr>
+      <w:tr>
+        <w:tc>
+          <w:tcPr/>
+          <w:p>
+            <w:pPr>
+              <w:pStyle w:val="Compact"/>
+            </w:pPr>
+            <w:r>
+              <w:t xml:space="preserve">« Si tout passe par vous, je deviens dépendant »</w:t>
+            </w:r>
+          </w:p>
+        </w:tc>
+        <w:tc>
+          <w:tcPr/>
+          <w:p>
+            <w:pPr>
+              <w:pStyle w:val="Compact"/>
+            </w:pPr>
+            <w:r>
+              <w:t xml:space="preserve">Vous gardez vos clients, votre magasin, vos prix et votre stock. Nous ne sommes qu'un canal de plus — et vous pouvez le couper quand vous voulez.</w:t>
+            </w:r>
+          </w:p>
+        </w:tc>
+      </w:tr>
+      <w:tr>
+        <w:tc>
+          <w:tcPr/>
+          <w:p>
+            <w:pPr>
+              <w:pStyle w:val="Compact"/>
+            </w:pPr>
+            <w:r>
+              <w:t xml:space="preserve">« Et la livraison, c'est moi qui la fais ? »</w:t>
+            </w:r>
+          </w:p>
+        </w:tc>
+        <w:tc>
+          <w:tcPr/>
+          <w:p>
+            <w:pPr>
+              <w:pStyle w:val="Compact"/>
+            </w:pPr>
+            <w:r>
+              <w:t xml:space="preserve">Non. Vous préparez la pièce, nous venons la prendre et nous livrons le client. Vous n'avez ni livreur à payer, ni course à faire, ni rendez-vous à honorer.</w:t>
             </w:r>
             <w:r>
               <w:t xml:space="preserve"> </w:t>
@@ -2398,6 +2491,46 @@
               <w:t xml:space="preserve"> </w:t>
             </w:r>
             <w:r>
+              <w:t xml:space="preserve">aujourd'hui, combien vous coûte une course pour porter une pièce à Yopougon ?</w:t>
+            </w:r>
+          </w:p>
+        </w:tc>
+      </w:tr>
+      <w:tr>
+        <w:tc>
+          <w:tcPr/>
+          <w:p>
+            <w:pPr>
+              <w:pStyle w:val="Compact"/>
+            </w:pPr>
+            <w:r>
+              <w:t xml:space="preserve">« Je ne vous connais pas, vous n'existez pas encore »</w:t>
+            </w:r>
+          </w:p>
+        </w:tc>
+        <w:tc>
+          <w:tcPr/>
+          <w:p>
+            <w:pPr>
+              <w:pStyle w:val="Compact"/>
+            </w:pPr>
+            <w:r>
+              <w:t xml:space="preserve">C'est exact, et c'est justement le moment : nous ouvrons dans les trente jours. Les vendeurs qui entrent maintenant sont ceux dont le stock est en ligne le premier jour, quand toute la demande arrive sur un catalogue encore court. Ceux qui viendront après entreront dans un catalogue déjà rempli.</w:t>
+            </w:r>
+            <w:r>
+              <w:t xml:space="preserve"> </w:t>
+            </w:r>
+            <w:r>
+              <w:rPr>
+                <w:i/>
+                <w:iCs/>
+              </w:rPr>
+              <w:t xml:space="preserve">Relancer :</w:t>
+            </w:r>
+            <w:r>
+              <w:t xml:space="preserve"> </w:t>
+            </w:r>
+            <w:r>
               <w:t xml:space="preserve">vous préférez être parmi les premiers, ou attendre de voir la place que les autres auront prise ?</w:t>
             </w:r>
           </w:p>
@@ -2480,10 +2613,10 @@
           <w:b/>
           <w:bCs/>
         </w:rPr>
-        <w:t xml:space="preserve">Elle est prélevée au reversement</w:t>
-      </w:r>
-      <w:r>
-        <w:t xml:space="preserve">, après livraison confirmée — jamais d'avance.</w:t>
+        <w:t xml:space="preserve">Elle est prélevée sur l'encaissement</w:t>
+      </w:r>
+      <w:r>
+        <w:t xml:space="preserve">, au moment où le client paie à la livraison — jamais d'avance. Le solde part vers le vendeur immédiatement.</w:t>
       </w:r>
     </w:p>
     <w:p>
@@ -3253,7 +3386,7 @@
               <w:pStyle w:val="Compact"/>
             </w:pPr>
             <w:r>
-              <w:t xml:space="preserve">Condition du reversement</w:t>
+              <w:t xml:space="preserve">Par quel canal on lui transmet son argent après l'encaissement</w:t>
             </w:r>
           </w:p>
         </w:tc>
@@ -3482,7 +3615,7 @@
         <w:pStyle w:val="BodyText"/>
       </w:pPr>
       <w:r>
-        <w:t xml:space="preserve">À partir de là, Pièces lui transmet ses commandes par WhatsApp — déjà payées — il confirme et prépare la pièce ; nous l'enlevons, nous livrons le client, et il est reversé après confirmation de livraison. Notre travail commercial n'est pas fini pour autant :</w:t>
+        <w:t xml:space="preserve">À partir de là, Pièces lui transmet ses commandes par WhatsApp ; il confirme et prépare la pièce, nous venons l'enlever, notre livreur encaisse le client à la remise, et l'argent du vendeur lui est transmis dans la foulée. Si le client ne paie pas, la pièce lui revient. Notre travail commercial n'est pas fini pour autant :</w:t>
       </w:r>
       <w:r>
         <w:t xml:space="preserve"> </w:t>

</xml_diff>